<commit_message>
Update report with correct student name
</commit_message>
<xml_diff>
--- a/report/Race_Condition_Report_FINAL.docx
+++ b/report/Race_Condition_Report_FINAL.docx
@@ -243,7 +243,7 @@
                 <w:sz w:val="20"/>
                 <w:szCs w:val="20"/>
               </w:rPr>
-              <w:t xml:space="preserve">Your Name Here</w:t>
+              <w:t>Yousef Hamda</w:t>
             </w:r>
           </w:p>
         </w:tc>
@@ -315,7 +315,7 @@
                 <w:sz w:val="20"/>
                 <w:szCs w:val="20"/>
               </w:rPr>
-              <w:t xml:space="preserve">Your Institution</w:t>
+              <w:t>Azrieli College of Engineering</w:t>
             </w:r>
           </w:p>
         </w:tc>

</xml_diff>